<commit_message>
fixed broken lesson link
</commit_message>
<xml_diff>
--- a/lessons/01/RaspberryPi4GettingStarted.Activity.docx
+++ b/lessons/01/RaspberryPi4GettingStarted.Activity.docx
@@ -1,6 +1,6 @@
 
 <file path=word/document.xml><?xml version="1.0" encoding="utf-8"?>
-<w:document xmlns:wpc="http://schemas.microsoft.com/office/word/2010/wordprocessingCanvas" xmlns:cx="http://schemas.microsoft.com/office/drawing/2014/chartex" xmlns:cx1="http://schemas.microsoft.com/office/drawing/2015/9/8/chartex" xmlns:cx2="http://schemas.microsoft.com/office/drawing/2015/10/21/chartex" xmlns:cx3="http://schemas.microsoft.com/office/drawing/2016/5/9/chartex" xmlns:cx4="http://schemas.microsoft.com/office/drawing/2016/5/10/chartex" xmlns:cx5="http://schemas.microsoft.com/office/drawing/2016/5/11/chartex" xmlns:cx6="http://schemas.microsoft.com/office/drawing/2016/5/12/chartex" xmlns:cx7="http://schemas.microsoft.com/office/drawing/2016/5/13/chartex" xmlns:cx8="http://schemas.microsoft.com/office/drawing/2016/5/14/chartex" xmlns:mc="http://schemas.openxmlformats.org/markup-compatibility/2006" xmlns:aink="http://schemas.microsoft.com/office/drawing/2016/ink" xmlns:am3d="http://schemas.microsoft.com/office/drawing/2017/model3d" xmlns:o="urn:schemas-microsoft-com:office:office" xmlns:r="http://schemas.openxmlformats.org/officeDocument/2006/relationships" xmlns:m="http://schemas.openxmlformats.org/officeDocument/2006/math" xmlns:v="urn:schemas-microsoft-com:vml" xmlns:wp14="http://schemas.microsoft.com/office/word/2010/wordprocessingDrawing" xmlns:wp="http://schemas.openxmlformats.org/drawingml/2006/wordprocessingDrawing" xmlns:w10="urn:schemas-microsoft-com:office:word" xmlns:w="http://schemas.openxmlformats.org/wordprocessingml/2006/main" xmlns:w14="http://schemas.microsoft.com/office/word/2010/wordml" xmlns:w15="http://schemas.microsoft.com/office/word/2012/wordml" xmlns:w16cex="http://schemas.microsoft.com/office/word/2018/wordml/cex" xmlns:w16cid="http://schemas.microsoft.com/office/word/2016/wordml/cid" xmlns:w16="http://schemas.microsoft.com/office/word/2018/wordml" xmlns:w16se="http://schemas.microsoft.com/office/word/2015/wordml/symex" xmlns:wpg="http://schemas.microsoft.com/office/word/2010/wordprocessingGroup" xmlns:wpi="http://schemas.microsoft.com/office/word/2010/wordprocessingInk" xmlns:wne="http://schemas.microsoft.com/office/word/2006/wordml" xmlns:wps="http://schemas.microsoft.com/office/word/2010/wordprocessingShape" mc:Ignorable="w14 w15 w16se w16cid w16 w16cex wp14">
+<w:document xmlns:wpc="http://schemas.microsoft.com/office/word/2010/wordprocessingCanvas" xmlns:cx="http://schemas.microsoft.com/office/drawing/2014/chartex" xmlns:cx1="http://schemas.microsoft.com/office/drawing/2015/9/8/chartex" xmlns:cx2="http://schemas.microsoft.com/office/drawing/2015/10/21/chartex" xmlns:cx3="http://schemas.microsoft.com/office/drawing/2016/5/9/chartex" xmlns:cx4="http://schemas.microsoft.com/office/drawing/2016/5/10/chartex" xmlns:cx5="http://schemas.microsoft.com/office/drawing/2016/5/11/chartex" xmlns:cx6="http://schemas.microsoft.com/office/drawing/2016/5/12/chartex" xmlns:cx7="http://schemas.microsoft.com/office/drawing/2016/5/13/chartex" xmlns:cx8="http://schemas.microsoft.com/office/drawing/2016/5/14/chartex" xmlns:mc="http://schemas.openxmlformats.org/markup-compatibility/2006" xmlns:aink="http://schemas.microsoft.com/office/drawing/2016/ink" xmlns:am3d="http://schemas.microsoft.com/office/drawing/2017/model3d" xmlns:o="urn:schemas-microsoft-com:office:office" xmlns:oel="http://schemas.microsoft.com/office/2019/extlst" xmlns:r="http://schemas.openxmlformats.org/officeDocument/2006/relationships" xmlns:m="http://schemas.openxmlformats.org/officeDocument/2006/math" xmlns:v="urn:schemas-microsoft-com:vml" xmlns:wp14="http://schemas.microsoft.com/office/word/2010/wordprocessingDrawing" xmlns:wp="http://schemas.openxmlformats.org/drawingml/2006/wordprocessingDrawing" xmlns:w10="urn:schemas-microsoft-com:office:word" xmlns:w="http://schemas.openxmlformats.org/wordprocessingml/2006/main" xmlns:w14="http://schemas.microsoft.com/office/word/2010/wordml" xmlns:w15="http://schemas.microsoft.com/office/word/2012/wordml" xmlns:w16cex="http://schemas.microsoft.com/office/word/2018/wordml/cex" xmlns:w16cid="http://schemas.microsoft.com/office/word/2016/wordml/cid" xmlns:w16="http://schemas.microsoft.com/office/word/2018/wordml" xmlns:w16sdtdh="http://schemas.microsoft.com/office/word/2020/wordml/sdtdatahash" xmlns:w16se="http://schemas.microsoft.com/office/word/2015/wordml/symex" xmlns:wpg="http://schemas.microsoft.com/office/word/2010/wordprocessingGroup" xmlns:wpi="http://schemas.microsoft.com/office/word/2010/wordprocessingInk" xmlns:wne="http://schemas.microsoft.com/office/word/2006/wordml" xmlns:wps="http://schemas.microsoft.com/office/word/2010/wordprocessingShape" mc:Ignorable="w14 w15 w16se w16cid w16 w16cex w16sdtdh wp14">
   <w:body>
     <w:p>
       <w:pPr>
@@ -43,7 +43,13 @@
         <w:rPr>
           <w:rFonts w:cs="Cavolini"/>
         </w:rPr>
-        <w:t>.0</w:t>
+        <w:t>.</w:t>
+      </w:r>
+      <w:r>
+        <w:rPr>
+          <w:rFonts w:cs="Cavolini"/>
+        </w:rPr>
+        <w:t>1</w:t>
       </w:r>
     </w:p>
     <w:p>
@@ -77,39 +83,7 @@
             <w:sz w:val="24"/>
             <w:szCs w:val="24"/>
           </w:rPr>
-          <w:t>Raspberry P</w:t>
-        </w:r>
-        <w:r>
-          <w:rPr>
-            <w:rStyle w:val="Hyperlink"/>
-            <w:sz w:val="24"/>
-            <w:szCs w:val="24"/>
-          </w:rPr>
-          <w:t>i</w:t>
-        </w:r>
-        <w:r>
-          <w:rPr>
-            <w:rStyle w:val="Hyperlink"/>
-            <w:sz w:val="24"/>
-            <w:szCs w:val="24"/>
-          </w:rPr>
-          <w:t xml:space="preserve"> Get</w:t>
-        </w:r>
-        <w:r>
-          <w:rPr>
-            <w:rStyle w:val="Hyperlink"/>
-            <w:sz w:val="24"/>
-            <w:szCs w:val="24"/>
-          </w:rPr>
-          <w:t>t</w:t>
-        </w:r>
-        <w:r>
-          <w:rPr>
-            <w:rStyle w:val="Hyperlink"/>
-            <w:sz w:val="24"/>
-            <w:szCs w:val="24"/>
-          </w:rPr>
-          <w:t>ing Started</w:t>
+          <w:t>Raspberry Pi Getting Started</w:t>
         </w:r>
       </w:hyperlink>
     </w:p>
@@ -176,15 +150,7 @@
         <w:spacing w:before="240"/>
       </w:pPr>
       <w:r>
-        <w:t xml:space="preserve">This Raspberry Pi comes in three memory options. List each option along with its current price. Search Amazon for current pricing. Try to locate a link for only the Pi computer and not the </w:t>
-      </w:r>
-      <w:proofErr w:type="spellStart"/>
-      <w:r>
-        <w:t>CanaKit</w:t>
-      </w:r>
-      <w:proofErr w:type="spellEnd"/>
-      <w:r>
-        <w:t xml:space="preserve"> solution discussed in the video.</w:t>
+        <w:t>This Raspberry Pi comes in three memory options. List each option along with its current price. Search Amazon for current pricing. Try to locate a link for only the Pi computer and not the CanaKit solution discussed in the video.</w:t>
       </w:r>
     </w:p>
     <w:tbl>
@@ -1111,7 +1077,7 @@
 </file>
 
 <file path=word/endnotes.xml><?xml version="1.0" encoding="utf-8"?>
-<w:endnotes xmlns:wpc="http://schemas.microsoft.com/office/word/2010/wordprocessingCanvas" xmlns:cx="http://schemas.microsoft.com/office/drawing/2014/chartex" xmlns:cx1="http://schemas.microsoft.com/office/drawing/2015/9/8/chartex" xmlns:cx2="http://schemas.microsoft.com/office/drawing/2015/10/21/chartex" xmlns:cx3="http://schemas.microsoft.com/office/drawing/2016/5/9/chartex" xmlns:cx4="http://schemas.microsoft.com/office/drawing/2016/5/10/chartex" xmlns:cx5="http://schemas.microsoft.com/office/drawing/2016/5/11/chartex" xmlns:cx6="http://schemas.microsoft.com/office/drawing/2016/5/12/chartex" xmlns:cx7="http://schemas.microsoft.com/office/drawing/2016/5/13/chartex" xmlns:cx8="http://schemas.microsoft.com/office/drawing/2016/5/14/chartex" xmlns:mc="http://schemas.openxmlformats.org/markup-compatibility/2006" xmlns:aink="http://schemas.microsoft.com/office/drawing/2016/ink" xmlns:am3d="http://schemas.microsoft.com/office/drawing/2017/model3d" xmlns:o="urn:schemas-microsoft-com:office:office" xmlns:r="http://schemas.openxmlformats.org/officeDocument/2006/relationships" xmlns:m="http://schemas.openxmlformats.org/officeDocument/2006/math" xmlns:v="urn:schemas-microsoft-com:vml" xmlns:wp14="http://schemas.microsoft.com/office/word/2010/wordprocessingDrawing" xmlns:wp="http://schemas.openxmlformats.org/drawingml/2006/wordprocessingDrawing" xmlns:w10="urn:schemas-microsoft-com:office:word" xmlns:w="http://schemas.openxmlformats.org/wordprocessingml/2006/main" xmlns:w14="http://schemas.microsoft.com/office/word/2010/wordml" xmlns:w15="http://schemas.microsoft.com/office/word/2012/wordml" xmlns:w16cex="http://schemas.microsoft.com/office/word/2018/wordml/cex" xmlns:w16cid="http://schemas.microsoft.com/office/word/2016/wordml/cid" xmlns:w16="http://schemas.microsoft.com/office/word/2018/wordml" xmlns:w16se="http://schemas.microsoft.com/office/word/2015/wordml/symex" xmlns:wpg="http://schemas.microsoft.com/office/word/2010/wordprocessingGroup" xmlns:wpi="http://schemas.microsoft.com/office/word/2010/wordprocessingInk" xmlns:wne="http://schemas.microsoft.com/office/word/2006/wordml" xmlns:wps="http://schemas.microsoft.com/office/word/2010/wordprocessingShape" mc:Ignorable="w14 w15 w16se w16cid w16 w16cex wp14">
+<w:endnotes xmlns:wpc="http://schemas.microsoft.com/office/word/2010/wordprocessingCanvas" xmlns:cx="http://schemas.microsoft.com/office/drawing/2014/chartex" xmlns:cx1="http://schemas.microsoft.com/office/drawing/2015/9/8/chartex" xmlns:cx2="http://schemas.microsoft.com/office/drawing/2015/10/21/chartex" xmlns:cx3="http://schemas.microsoft.com/office/drawing/2016/5/9/chartex" xmlns:cx4="http://schemas.microsoft.com/office/drawing/2016/5/10/chartex" xmlns:cx5="http://schemas.microsoft.com/office/drawing/2016/5/11/chartex" xmlns:cx6="http://schemas.microsoft.com/office/drawing/2016/5/12/chartex" xmlns:cx7="http://schemas.microsoft.com/office/drawing/2016/5/13/chartex" xmlns:cx8="http://schemas.microsoft.com/office/drawing/2016/5/14/chartex" xmlns:mc="http://schemas.openxmlformats.org/markup-compatibility/2006" xmlns:aink="http://schemas.microsoft.com/office/drawing/2016/ink" xmlns:am3d="http://schemas.microsoft.com/office/drawing/2017/model3d" xmlns:o="urn:schemas-microsoft-com:office:office" xmlns:oel="http://schemas.microsoft.com/office/2019/extlst" xmlns:r="http://schemas.openxmlformats.org/officeDocument/2006/relationships" xmlns:m="http://schemas.openxmlformats.org/officeDocument/2006/math" xmlns:v="urn:schemas-microsoft-com:vml" xmlns:wp14="http://schemas.microsoft.com/office/word/2010/wordprocessingDrawing" xmlns:wp="http://schemas.openxmlformats.org/drawingml/2006/wordprocessingDrawing" xmlns:w10="urn:schemas-microsoft-com:office:word" xmlns:w="http://schemas.openxmlformats.org/wordprocessingml/2006/main" xmlns:w14="http://schemas.microsoft.com/office/word/2010/wordml" xmlns:w15="http://schemas.microsoft.com/office/word/2012/wordml" xmlns:w16cex="http://schemas.microsoft.com/office/word/2018/wordml/cex" xmlns:w16cid="http://schemas.microsoft.com/office/word/2016/wordml/cid" xmlns:w16="http://schemas.microsoft.com/office/word/2018/wordml" xmlns:w16sdtdh="http://schemas.microsoft.com/office/word/2020/wordml/sdtdatahash" xmlns:w16se="http://schemas.microsoft.com/office/word/2015/wordml/symex" xmlns:wpg="http://schemas.microsoft.com/office/word/2010/wordprocessingGroup" xmlns:wpi="http://schemas.microsoft.com/office/word/2010/wordprocessingInk" xmlns:wne="http://schemas.microsoft.com/office/word/2006/wordml" xmlns:wps="http://schemas.microsoft.com/office/word/2010/wordprocessingShape" mc:Ignorable="w14 w15 w16se w16cid w16 w16cex w16sdtdh wp14">
   <w:endnote w:type="separator" w:id="-1">
     <w:p>
       <w:pPr>
@@ -1136,7 +1102,7 @@
 </file>
 
 <file path=word/footer1.xml><?xml version="1.0" encoding="utf-8"?>
-<w:ftr xmlns:wpc="http://schemas.microsoft.com/office/word/2010/wordprocessingCanvas" xmlns:cx="http://schemas.microsoft.com/office/drawing/2014/chartex" xmlns:cx1="http://schemas.microsoft.com/office/drawing/2015/9/8/chartex" xmlns:cx2="http://schemas.microsoft.com/office/drawing/2015/10/21/chartex" xmlns:cx3="http://schemas.microsoft.com/office/drawing/2016/5/9/chartex" xmlns:cx4="http://schemas.microsoft.com/office/drawing/2016/5/10/chartex" xmlns:cx5="http://schemas.microsoft.com/office/drawing/2016/5/11/chartex" xmlns:cx6="http://schemas.microsoft.com/office/drawing/2016/5/12/chartex" xmlns:cx7="http://schemas.microsoft.com/office/drawing/2016/5/13/chartex" xmlns:cx8="http://schemas.microsoft.com/office/drawing/2016/5/14/chartex" xmlns:mc="http://schemas.openxmlformats.org/markup-compatibility/2006" xmlns:aink="http://schemas.microsoft.com/office/drawing/2016/ink" xmlns:am3d="http://schemas.microsoft.com/office/drawing/2017/model3d" xmlns:o="urn:schemas-microsoft-com:office:office" xmlns:r="http://schemas.openxmlformats.org/officeDocument/2006/relationships" xmlns:m="http://schemas.openxmlformats.org/officeDocument/2006/math" xmlns:v="urn:schemas-microsoft-com:vml" xmlns:wp14="http://schemas.microsoft.com/office/word/2010/wordprocessingDrawing" xmlns:wp="http://schemas.openxmlformats.org/drawingml/2006/wordprocessingDrawing" xmlns:w10="urn:schemas-microsoft-com:office:word" xmlns:w="http://schemas.openxmlformats.org/wordprocessingml/2006/main" xmlns:w14="http://schemas.microsoft.com/office/word/2010/wordml" xmlns:w15="http://schemas.microsoft.com/office/word/2012/wordml" xmlns:w16cex="http://schemas.microsoft.com/office/word/2018/wordml/cex" xmlns:w16cid="http://schemas.microsoft.com/office/word/2016/wordml/cid" xmlns:w16="http://schemas.microsoft.com/office/word/2018/wordml" xmlns:w16se="http://schemas.microsoft.com/office/word/2015/wordml/symex" xmlns:wpg="http://schemas.microsoft.com/office/word/2010/wordprocessingGroup" xmlns:wpi="http://schemas.microsoft.com/office/word/2010/wordprocessingInk" xmlns:wne="http://schemas.microsoft.com/office/word/2006/wordml" xmlns:wps="http://schemas.microsoft.com/office/word/2010/wordprocessingShape" mc:Ignorable="w14 w15 w16se w16cid w16 w16cex wp14">
+<w:ftr xmlns:wpc="http://schemas.microsoft.com/office/word/2010/wordprocessingCanvas" xmlns:cx="http://schemas.microsoft.com/office/drawing/2014/chartex" xmlns:cx1="http://schemas.microsoft.com/office/drawing/2015/9/8/chartex" xmlns:cx2="http://schemas.microsoft.com/office/drawing/2015/10/21/chartex" xmlns:cx3="http://schemas.microsoft.com/office/drawing/2016/5/9/chartex" xmlns:cx4="http://schemas.microsoft.com/office/drawing/2016/5/10/chartex" xmlns:cx5="http://schemas.microsoft.com/office/drawing/2016/5/11/chartex" xmlns:cx6="http://schemas.microsoft.com/office/drawing/2016/5/12/chartex" xmlns:cx7="http://schemas.microsoft.com/office/drawing/2016/5/13/chartex" xmlns:cx8="http://schemas.microsoft.com/office/drawing/2016/5/14/chartex" xmlns:mc="http://schemas.openxmlformats.org/markup-compatibility/2006" xmlns:aink="http://schemas.microsoft.com/office/drawing/2016/ink" xmlns:am3d="http://schemas.microsoft.com/office/drawing/2017/model3d" xmlns:o="urn:schemas-microsoft-com:office:office" xmlns:oel="http://schemas.microsoft.com/office/2019/extlst" xmlns:r="http://schemas.openxmlformats.org/officeDocument/2006/relationships" xmlns:m="http://schemas.openxmlformats.org/officeDocument/2006/math" xmlns:v="urn:schemas-microsoft-com:vml" xmlns:wp14="http://schemas.microsoft.com/office/word/2010/wordprocessingDrawing" xmlns:wp="http://schemas.openxmlformats.org/drawingml/2006/wordprocessingDrawing" xmlns:w10="urn:schemas-microsoft-com:office:word" xmlns:w="http://schemas.openxmlformats.org/wordprocessingml/2006/main" xmlns:w14="http://schemas.microsoft.com/office/word/2010/wordml" xmlns:w15="http://schemas.microsoft.com/office/word/2012/wordml" xmlns:w16cex="http://schemas.microsoft.com/office/word/2018/wordml/cex" xmlns:w16cid="http://schemas.microsoft.com/office/word/2016/wordml/cid" xmlns:w16="http://schemas.microsoft.com/office/word/2018/wordml" xmlns:w16sdtdh="http://schemas.microsoft.com/office/word/2020/wordml/sdtdatahash" xmlns:w16se="http://schemas.microsoft.com/office/word/2015/wordml/symex" xmlns:wpg="http://schemas.microsoft.com/office/word/2010/wordprocessingGroup" xmlns:wpi="http://schemas.microsoft.com/office/word/2010/wordprocessingInk" xmlns:wne="http://schemas.microsoft.com/office/word/2006/wordml" xmlns:wps="http://schemas.microsoft.com/office/word/2010/wordprocessingShape" mc:Ignorable="w14 w15 w16se w16cid w16 w16cex w16sdtdh wp14">
   <w:sdt>
     <w:sdtPr>
       <w:id w:val="973801655"/>
@@ -1205,7 +1171,7 @@
 </file>
 
 <file path=word/footnotes.xml><?xml version="1.0" encoding="utf-8"?>
-<w:footnotes xmlns:wpc="http://schemas.microsoft.com/office/word/2010/wordprocessingCanvas" xmlns:cx="http://schemas.microsoft.com/office/drawing/2014/chartex" xmlns:cx1="http://schemas.microsoft.com/office/drawing/2015/9/8/chartex" xmlns:cx2="http://schemas.microsoft.com/office/drawing/2015/10/21/chartex" xmlns:cx3="http://schemas.microsoft.com/office/drawing/2016/5/9/chartex" xmlns:cx4="http://schemas.microsoft.com/office/drawing/2016/5/10/chartex" xmlns:cx5="http://schemas.microsoft.com/office/drawing/2016/5/11/chartex" xmlns:cx6="http://schemas.microsoft.com/office/drawing/2016/5/12/chartex" xmlns:cx7="http://schemas.microsoft.com/office/drawing/2016/5/13/chartex" xmlns:cx8="http://schemas.microsoft.com/office/drawing/2016/5/14/chartex" xmlns:mc="http://schemas.openxmlformats.org/markup-compatibility/2006" xmlns:aink="http://schemas.microsoft.com/office/drawing/2016/ink" xmlns:am3d="http://schemas.microsoft.com/office/drawing/2017/model3d" xmlns:o="urn:schemas-microsoft-com:office:office" xmlns:r="http://schemas.openxmlformats.org/officeDocument/2006/relationships" xmlns:m="http://schemas.openxmlformats.org/officeDocument/2006/math" xmlns:v="urn:schemas-microsoft-com:vml" xmlns:wp14="http://schemas.microsoft.com/office/word/2010/wordprocessingDrawing" xmlns:wp="http://schemas.openxmlformats.org/drawingml/2006/wordprocessingDrawing" xmlns:w10="urn:schemas-microsoft-com:office:word" xmlns:w="http://schemas.openxmlformats.org/wordprocessingml/2006/main" xmlns:w14="http://schemas.microsoft.com/office/word/2010/wordml" xmlns:w15="http://schemas.microsoft.com/office/word/2012/wordml" xmlns:w16cex="http://schemas.microsoft.com/office/word/2018/wordml/cex" xmlns:w16cid="http://schemas.microsoft.com/office/word/2016/wordml/cid" xmlns:w16="http://schemas.microsoft.com/office/word/2018/wordml" xmlns:w16se="http://schemas.microsoft.com/office/word/2015/wordml/symex" xmlns:wpg="http://schemas.microsoft.com/office/word/2010/wordprocessingGroup" xmlns:wpi="http://schemas.microsoft.com/office/word/2010/wordprocessingInk" xmlns:wne="http://schemas.microsoft.com/office/word/2006/wordml" xmlns:wps="http://schemas.microsoft.com/office/word/2010/wordprocessingShape" mc:Ignorable="w14 w15 w16se w16cid w16 w16cex wp14">
+<w:footnotes xmlns:wpc="http://schemas.microsoft.com/office/word/2010/wordprocessingCanvas" xmlns:cx="http://schemas.microsoft.com/office/drawing/2014/chartex" xmlns:cx1="http://schemas.microsoft.com/office/drawing/2015/9/8/chartex" xmlns:cx2="http://schemas.microsoft.com/office/drawing/2015/10/21/chartex" xmlns:cx3="http://schemas.microsoft.com/office/drawing/2016/5/9/chartex" xmlns:cx4="http://schemas.microsoft.com/office/drawing/2016/5/10/chartex" xmlns:cx5="http://schemas.microsoft.com/office/drawing/2016/5/11/chartex" xmlns:cx6="http://schemas.microsoft.com/office/drawing/2016/5/12/chartex" xmlns:cx7="http://schemas.microsoft.com/office/drawing/2016/5/13/chartex" xmlns:cx8="http://schemas.microsoft.com/office/drawing/2016/5/14/chartex" xmlns:mc="http://schemas.openxmlformats.org/markup-compatibility/2006" xmlns:aink="http://schemas.microsoft.com/office/drawing/2016/ink" xmlns:am3d="http://schemas.microsoft.com/office/drawing/2017/model3d" xmlns:o="urn:schemas-microsoft-com:office:office" xmlns:oel="http://schemas.microsoft.com/office/2019/extlst" xmlns:r="http://schemas.openxmlformats.org/officeDocument/2006/relationships" xmlns:m="http://schemas.openxmlformats.org/officeDocument/2006/math" xmlns:v="urn:schemas-microsoft-com:vml" xmlns:wp14="http://schemas.microsoft.com/office/word/2010/wordprocessingDrawing" xmlns:wp="http://schemas.openxmlformats.org/drawingml/2006/wordprocessingDrawing" xmlns:w10="urn:schemas-microsoft-com:office:word" xmlns:w="http://schemas.openxmlformats.org/wordprocessingml/2006/main" xmlns:w14="http://schemas.microsoft.com/office/word/2010/wordml" xmlns:w15="http://schemas.microsoft.com/office/word/2012/wordml" xmlns:w16cex="http://schemas.microsoft.com/office/word/2018/wordml/cex" xmlns:w16cid="http://schemas.microsoft.com/office/word/2016/wordml/cid" xmlns:w16="http://schemas.microsoft.com/office/word/2018/wordml" xmlns:w16sdtdh="http://schemas.microsoft.com/office/word/2020/wordml/sdtdatahash" xmlns:w16se="http://schemas.microsoft.com/office/word/2015/wordml/symex" xmlns:wpg="http://schemas.microsoft.com/office/word/2010/wordprocessingGroup" xmlns:wpi="http://schemas.microsoft.com/office/word/2010/wordprocessingInk" xmlns:wne="http://schemas.microsoft.com/office/word/2006/wordml" xmlns:wps="http://schemas.microsoft.com/office/word/2010/wordprocessingShape" mc:Ignorable="w14 w15 w16se w16cid w16 w16cex w16sdtdh wp14">
   <w:footnote w:type="separator" w:id="-1">
     <w:p>
       <w:pPr>
@@ -1230,7 +1196,7 @@
 </file>
 
 <file path=word/header1.xml><?xml version="1.0" encoding="utf-8"?>
-<w:hdr xmlns:wpc="http://schemas.microsoft.com/office/word/2010/wordprocessingCanvas" xmlns:cx="http://schemas.microsoft.com/office/drawing/2014/chartex" xmlns:cx1="http://schemas.microsoft.com/office/drawing/2015/9/8/chartex" xmlns:cx2="http://schemas.microsoft.com/office/drawing/2015/10/21/chartex" xmlns:cx3="http://schemas.microsoft.com/office/drawing/2016/5/9/chartex" xmlns:cx4="http://schemas.microsoft.com/office/drawing/2016/5/10/chartex" xmlns:cx5="http://schemas.microsoft.com/office/drawing/2016/5/11/chartex" xmlns:cx6="http://schemas.microsoft.com/office/drawing/2016/5/12/chartex" xmlns:cx7="http://schemas.microsoft.com/office/drawing/2016/5/13/chartex" xmlns:cx8="http://schemas.microsoft.com/office/drawing/2016/5/14/chartex" xmlns:mc="http://schemas.openxmlformats.org/markup-compatibility/2006" xmlns:aink="http://schemas.microsoft.com/office/drawing/2016/ink" xmlns:am3d="http://schemas.microsoft.com/office/drawing/2017/model3d" xmlns:o="urn:schemas-microsoft-com:office:office" xmlns:r="http://schemas.openxmlformats.org/officeDocument/2006/relationships" xmlns:m="http://schemas.openxmlformats.org/officeDocument/2006/math" xmlns:v="urn:schemas-microsoft-com:vml" xmlns:wp14="http://schemas.microsoft.com/office/word/2010/wordprocessingDrawing" xmlns:wp="http://schemas.openxmlformats.org/drawingml/2006/wordprocessingDrawing" xmlns:w10="urn:schemas-microsoft-com:office:word" xmlns:w="http://schemas.openxmlformats.org/wordprocessingml/2006/main" xmlns:w14="http://schemas.microsoft.com/office/word/2010/wordml" xmlns:w15="http://schemas.microsoft.com/office/word/2012/wordml" xmlns:w16cex="http://schemas.microsoft.com/office/word/2018/wordml/cex" xmlns:w16cid="http://schemas.microsoft.com/office/word/2016/wordml/cid" xmlns:w16="http://schemas.microsoft.com/office/word/2018/wordml" xmlns:w16se="http://schemas.microsoft.com/office/word/2015/wordml/symex" xmlns:wpg="http://schemas.microsoft.com/office/word/2010/wordprocessingGroup" xmlns:wpi="http://schemas.microsoft.com/office/word/2010/wordprocessingInk" xmlns:wne="http://schemas.microsoft.com/office/word/2006/wordml" xmlns:wps="http://schemas.microsoft.com/office/word/2010/wordprocessingShape" mc:Ignorable="w14 w15 w16se w16cid w16 w16cex wp14">
+<w:hdr xmlns:wpc="http://schemas.microsoft.com/office/word/2010/wordprocessingCanvas" xmlns:cx="http://schemas.microsoft.com/office/drawing/2014/chartex" xmlns:cx1="http://schemas.microsoft.com/office/drawing/2015/9/8/chartex" xmlns:cx2="http://schemas.microsoft.com/office/drawing/2015/10/21/chartex" xmlns:cx3="http://schemas.microsoft.com/office/drawing/2016/5/9/chartex" xmlns:cx4="http://schemas.microsoft.com/office/drawing/2016/5/10/chartex" xmlns:cx5="http://schemas.microsoft.com/office/drawing/2016/5/11/chartex" xmlns:cx6="http://schemas.microsoft.com/office/drawing/2016/5/12/chartex" xmlns:cx7="http://schemas.microsoft.com/office/drawing/2016/5/13/chartex" xmlns:cx8="http://schemas.microsoft.com/office/drawing/2016/5/14/chartex" xmlns:mc="http://schemas.openxmlformats.org/markup-compatibility/2006" xmlns:aink="http://schemas.microsoft.com/office/drawing/2016/ink" xmlns:am3d="http://schemas.microsoft.com/office/drawing/2017/model3d" xmlns:o="urn:schemas-microsoft-com:office:office" xmlns:oel="http://schemas.microsoft.com/office/2019/extlst" xmlns:r="http://schemas.openxmlformats.org/officeDocument/2006/relationships" xmlns:m="http://schemas.openxmlformats.org/officeDocument/2006/math" xmlns:v="urn:schemas-microsoft-com:vml" xmlns:wp14="http://schemas.microsoft.com/office/word/2010/wordprocessingDrawing" xmlns:wp="http://schemas.openxmlformats.org/drawingml/2006/wordprocessingDrawing" xmlns:w10="urn:schemas-microsoft-com:office:word" xmlns:w="http://schemas.openxmlformats.org/wordprocessingml/2006/main" xmlns:w14="http://schemas.microsoft.com/office/word/2010/wordml" xmlns:w15="http://schemas.microsoft.com/office/word/2012/wordml" xmlns:w16cex="http://schemas.microsoft.com/office/word/2018/wordml/cex" xmlns:w16cid="http://schemas.microsoft.com/office/word/2016/wordml/cid" xmlns:w16="http://schemas.microsoft.com/office/word/2018/wordml" xmlns:w16sdtdh="http://schemas.microsoft.com/office/word/2020/wordml/sdtdatahash" xmlns:w16se="http://schemas.microsoft.com/office/word/2015/wordml/symex" xmlns:wpg="http://schemas.microsoft.com/office/word/2010/wordprocessingGroup" xmlns:wpi="http://schemas.microsoft.com/office/word/2010/wordprocessingInk" xmlns:wne="http://schemas.microsoft.com/office/word/2006/wordml" xmlns:wps="http://schemas.microsoft.com/office/word/2010/wordprocessingShape" mc:Ignorable="w14 w15 w16se w16cid w16 w16cex w16sdtdh wp14">
   <w:p>
     <w:pPr>
       <w:pStyle w:val="Heading1"/>
@@ -1250,7 +1216,7 @@
 </file>
 
 <file path=word/numbering.xml><?xml version="1.0" encoding="utf-8"?>
-<w:numbering xmlns:wpc="http://schemas.microsoft.com/office/word/2010/wordprocessingCanvas" xmlns:cx="http://schemas.microsoft.com/office/drawing/2014/chartex" xmlns:cx1="http://schemas.microsoft.com/office/drawing/2015/9/8/chartex" xmlns:cx2="http://schemas.microsoft.com/office/drawing/2015/10/21/chartex" xmlns:cx3="http://schemas.microsoft.com/office/drawing/2016/5/9/chartex" xmlns:cx4="http://schemas.microsoft.com/office/drawing/2016/5/10/chartex" xmlns:cx5="http://schemas.microsoft.com/office/drawing/2016/5/11/chartex" xmlns:cx6="http://schemas.microsoft.com/office/drawing/2016/5/12/chartex" xmlns:cx7="http://schemas.microsoft.com/office/drawing/2016/5/13/chartex" xmlns:cx8="http://schemas.microsoft.com/office/drawing/2016/5/14/chartex" xmlns:mc="http://schemas.openxmlformats.org/markup-compatibility/2006" xmlns:aink="http://schemas.microsoft.com/office/drawing/2016/ink" xmlns:am3d="http://schemas.microsoft.com/office/drawing/2017/model3d" xmlns:o="urn:schemas-microsoft-com:office:office" xmlns:r="http://schemas.openxmlformats.org/officeDocument/2006/relationships" xmlns:m="http://schemas.openxmlformats.org/officeDocument/2006/math" xmlns:v="urn:schemas-microsoft-com:vml" xmlns:wp14="http://schemas.microsoft.com/office/word/2010/wordprocessingDrawing" xmlns:wp="http://schemas.openxmlformats.org/drawingml/2006/wordprocessingDrawing" xmlns:w10="urn:schemas-microsoft-com:office:word" xmlns:w="http://schemas.openxmlformats.org/wordprocessingml/2006/main" xmlns:w14="http://schemas.microsoft.com/office/word/2010/wordml" xmlns:w15="http://schemas.microsoft.com/office/word/2012/wordml" xmlns:w16cex="http://schemas.microsoft.com/office/word/2018/wordml/cex" xmlns:w16cid="http://schemas.microsoft.com/office/word/2016/wordml/cid" xmlns:w16="http://schemas.microsoft.com/office/word/2018/wordml" xmlns:w16se="http://schemas.microsoft.com/office/word/2015/wordml/symex" xmlns:wpg="http://schemas.microsoft.com/office/word/2010/wordprocessingGroup" xmlns:wpi="http://schemas.microsoft.com/office/word/2010/wordprocessingInk" xmlns:wne="http://schemas.microsoft.com/office/word/2006/wordml" xmlns:wps="http://schemas.microsoft.com/office/word/2010/wordprocessingShape" mc:Ignorable="w14 w15 w16se w16cid w16 w16cex wp14">
+<w:numbering xmlns:wpc="http://schemas.microsoft.com/office/word/2010/wordprocessingCanvas" xmlns:cx="http://schemas.microsoft.com/office/drawing/2014/chartex" xmlns:cx1="http://schemas.microsoft.com/office/drawing/2015/9/8/chartex" xmlns:cx2="http://schemas.microsoft.com/office/drawing/2015/10/21/chartex" xmlns:cx3="http://schemas.microsoft.com/office/drawing/2016/5/9/chartex" xmlns:cx4="http://schemas.microsoft.com/office/drawing/2016/5/10/chartex" xmlns:cx5="http://schemas.microsoft.com/office/drawing/2016/5/11/chartex" xmlns:cx6="http://schemas.microsoft.com/office/drawing/2016/5/12/chartex" xmlns:cx7="http://schemas.microsoft.com/office/drawing/2016/5/13/chartex" xmlns:cx8="http://schemas.microsoft.com/office/drawing/2016/5/14/chartex" xmlns:mc="http://schemas.openxmlformats.org/markup-compatibility/2006" xmlns:aink="http://schemas.microsoft.com/office/drawing/2016/ink" xmlns:am3d="http://schemas.microsoft.com/office/drawing/2017/model3d" xmlns:o="urn:schemas-microsoft-com:office:office" xmlns:oel="http://schemas.microsoft.com/office/2019/extlst" xmlns:r="http://schemas.openxmlformats.org/officeDocument/2006/relationships" xmlns:m="http://schemas.openxmlformats.org/officeDocument/2006/math" xmlns:v="urn:schemas-microsoft-com:vml" xmlns:wp14="http://schemas.microsoft.com/office/word/2010/wordprocessingDrawing" xmlns:wp="http://schemas.openxmlformats.org/drawingml/2006/wordprocessingDrawing" xmlns:w10="urn:schemas-microsoft-com:office:word" xmlns:w="http://schemas.openxmlformats.org/wordprocessingml/2006/main" xmlns:w14="http://schemas.microsoft.com/office/word/2010/wordml" xmlns:w15="http://schemas.microsoft.com/office/word/2012/wordml" xmlns:w16cex="http://schemas.microsoft.com/office/word/2018/wordml/cex" xmlns:w16cid="http://schemas.microsoft.com/office/word/2016/wordml/cid" xmlns:w16="http://schemas.microsoft.com/office/word/2018/wordml" xmlns:w16sdtdh="http://schemas.microsoft.com/office/word/2020/wordml/sdtdatahash" xmlns:w16se="http://schemas.microsoft.com/office/word/2015/wordml/symex" xmlns:wpg="http://schemas.microsoft.com/office/word/2010/wordprocessingGroup" xmlns:wpi="http://schemas.microsoft.com/office/word/2010/wordprocessingInk" xmlns:wne="http://schemas.microsoft.com/office/word/2006/wordml" xmlns:wps="http://schemas.microsoft.com/office/word/2010/wordprocessingShape" mc:Ignorable="w14 w15 w16se w16cid w16 w16cex w16sdtdh wp14">
   <w:abstractNum w:abstractNumId="0" w15:restartNumberingAfterBreak="0">
     <w:nsid w:val="0B9B6B9F"/>
     <w:multiLevelType w:val="hybridMultilevel"/>
@@ -2569,56 +2535,56 @@
       </w:pPr>
     </w:lvl>
   </w:abstractNum>
-  <w:num w:numId="1">
+  <w:num w:numId="1" w16cid:durableId="429741701">
     <w:abstractNumId w:val="3"/>
   </w:num>
-  <w:num w:numId="2">
+  <w:num w:numId="2" w16cid:durableId="1407073173">
     <w:abstractNumId w:val="4"/>
   </w:num>
-  <w:num w:numId="3">
+  <w:num w:numId="3" w16cid:durableId="1533615486">
     <w:abstractNumId w:val="7"/>
   </w:num>
-  <w:num w:numId="4">
+  <w:num w:numId="4" w16cid:durableId="401488027">
     <w:abstractNumId w:val="13"/>
   </w:num>
-  <w:num w:numId="5">
+  <w:num w:numId="5" w16cid:durableId="1365908546">
     <w:abstractNumId w:val="2"/>
   </w:num>
-  <w:num w:numId="6">
+  <w:num w:numId="6" w16cid:durableId="1958565168">
     <w:abstractNumId w:val="9"/>
   </w:num>
-  <w:num w:numId="7">
+  <w:num w:numId="7" w16cid:durableId="565147627">
     <w:abstractNumId w:val="8"/>
   </w:num>
-  <w:num w:numId="8">
+  <w:num w:numId="8" w16cid:durableId="2045790714">
     <w:abstractNumId w:val="10"/>
   </w:num>
-  <w:num w:numId="9">
+  <w:num w:numId="9" w16cid:durableId="1427190716">
     <w:abstractNumId w:val="11"/>
   </w:num>
-  <w:num w:numId="10">
+  <w:num w:numId="10" w16cid:durableId="1523545222">
     <w:abstractNumId w:val="14"/>
   </w:num>
-  <w:num w:numId="11">
+  <w:num w:numId="11" w16cid:durableId="37748987">
     <w:abstractNumId w:val="0"/>
   </w:num>
-  <w:num w:numId="12">
+  <w:num w:numId="12" w16cid:durableId="320817110">
     <w:abstractNumId w:val="5"/>
   </w:num>
-  <w:num w:numId="13">
+  <w:num w:numId="13" w16cid:durableId="1198004376">
     <w:abstractNumId w:val="1"/>
   </w:num>
-  <w:num w:numId="14">
+  <w:num w:numId="14" w16cid:durableId="766199692">
     <w:abstractNumId w:val="6"/>
   </w:num>
-  <w:num w:numId="15">
+  <w:num w:numId="15" w16cid:durableId="665715439">
     <w:abstractNumId w:val="12"/>
   </w:num>
 </w:numbering>
 </file>
 
 <file path=word/styles.xml><?xml version="1.0" encoding="utf-8"?>
-<w:styles xmlns:mc="http://schemas.openxmlformats.org/markup-compatibility/2006" xmlns:r="http://schemas.openxmlformats.org/officeDocument/2006/relationships" xmlns:w="http://schemas.openxmlformats.org/wordprocessingml/2006/main" xmlns:w14="http://schemas.microsoft.com/office/word/2010/wordml" xmlns:w15="http://schemas.microsoft.com/office/word/2012/wordml" xmlns:w16cex="http://schemas.microsoft.com/office/word/2018/wordml/cex" xmlns:w16cid="http://schemas.microsoft.com/office/word/2016/wordml/cid" xmlns:w16="http://schemas.microsoft.com/office/word/2018/wordml" xmlns:w16se="http://schemas.microsoft.com/office/word/2015/wordml/symex" mc:Ignorable="w14 w15 w16se w16cid w16 w16cex">
+<w:styles xmlns:mc="http://schemas.openxmlformats.org/markup-compatibility/2006" xmlns:r="http://schemas.openxmlformats.org/officeDocument/2006/relationships" xmlns:w="http://schemas.openxmlformats.org/wordprocessingml/2006/main" xmlns:w14="http://schemas.microsoft.com/office/word/2010/wordml" xmlns:w15="http://schemas.microsoft.com/office/word/2012/wordml" xmlns:w16cex="http://schemas.microsoft.com/office/word/2018/wordml/cex" xmlns:w16cid="http://schemas.microsoft.com/office/word/2016/wordml/cid" xmlns:w16="http://schemas.microsoft.com/office/word/2018/wordml" xmlns:w16sdtdh="http://schemas.microsoft.com/office/word/2020/wordml/sdtdatahash" xmlns:w16se="http://schemas.microsoft.com/office/word/2015/wordml/symex" mc:Ignorable="w14 w15 w16se w16cid w16 w16cex w16sdtdh">
   <w:docDefaults>
     <w:rPrDefault>
       <w:rPr>

</xml_diff>